<commit_message>
docs(install guide): redesign for flow and scanning
Three reviewers (bolder redesign / keep it simple / judge) agreed the guide's
problems were order and buried actions, not looks. Now: page 1 is the whole
install as Step 1, 2, 3 (matching the README), "request LibreOffice on day
one" is a callout at the top of Step 1, the paste-in request is one shaded,
bordered plain-text line labeled "Copy all of this into Claude", and Restart
is its own step. Page 2: first deck (OneDrive callout first), updates, a
troubleshooting table (Git moved there), learn more. 11 pt body on 15 pt
leading, about 88-character lines, bold accent headers over thin rules so it
prints cleanly. The build still copies the request from README and fails if
it is not one plain ASCII line.

Co-Authored-By: Claude Opus 5.5 <noreply@anthropic.com>
</commit_message>
<xml_diff>
--- a/Slide-Lab-Install-Guide.docx
+++ b/Slide-Lab-Install-Guide.docx
@@ -4,141 +4,200 @@
   <w:body>
     <w:p>
       <w:pPr>
-        <w:spacing w:after="0"/>
+        <w:spacing w:after="80" w:lineRule="exact" w:line="560"/>
       </w:pPr>
       <w:r>
         <w:rPr>
           <w:b/>
           <w:color w:val="0B3C49"/>
-          <w:sz w:val="44"/>
+          <w:sz w:val="48"/>
         </w:rPr>
         <w:t>Slide Lab install guide</w:t>
       </w:r>
     </w:p>
     <w:p>
       <w:pPr>
-        <w:spacing w:after="40" w:before="0" w:line="259" w:lineRule="auto"/>
+        <w:keepNext w:val="0"/>
+        <w:widowControl/>
+        <w:spacing w:before="0" w:after="200" w:lineRule="exact" w:line="320"/>
       </w:pPr>
       <w:r>
         <w:rPr>
           <w:b w:val="0"/>
           <w:i w:val="0"/>
           <w:color w:val="5A5A5A"/>
-          <w:sz w:val="21"/>
+          <w:sz w:val="24"/>
         </w:rPr>
-        <w:t xml:space="preserve">Set up Slide Lab on your computer and build your first deck. </w:t>
-      </w:r>
-      <w:r>
-        <w:rPr>
-          <w:b w:val="0"/>
-          <w:i/>
-          <w:color w:val="5A5A5A"/>
-          <w:sz w:val="21"/>
-        </w:rPr>
-        <w:t>Accurate as of 2 October 2026.</w:t>
+        <w:t>Three steps, about 20 to 45 minutes the first time, plus however long your software portal takes to approve and install LibreOffice.</w:t>
       </w:r>
     </w:p>
     <w:p>
       <w:pPr>
-        <w:spacing w:after="80"/>
+        <w:keepNext w:val="0"/>
+        <w:widowControl/>
+        <w:spacing w:before="0" w:after="0" w:lineRule="exact" w:line="300"/>
         <w:pBdr>
-          <w:bottom w:val="single" w:sz="8" w:space="1" w:color="0B3C49"/>
+          <w:bottom w:val="single" w:sz="8" w:space="10" w:color="0B3C49"/>
         </w:pBdr>
-      </w:pPr>
-    </w:p>
-    <w:p>
-      <w:pPr>
-        <w:keepNext/>
-        <w:spacing w:before="200" w:after="60"/>
       </w:pPr>
       <w:r>
         <w:rPr>
-          <w:b/>
-          <w:color w:val="0B3C49"/>
-          <w:sz w:val="26"/>
-        </w:rPr>
-        <w:t>1. What Slide Lab is</w:t>
-      </w:r>
-    </w:p>
-    <w:p>
-      <w:pPr>
-        <w:spacing w:after="80" w:before="0" w:line="259" w:lineRule="auto"/>
-      </w:pPr>
-      <w:r>
-        <w:rPr>
+          <w:b w:val="0"/>
+          <w:i w:val="0"/>
           <w:color w:val="222222"/>
-          <w:sz w:val="21"/>
+          <w:sz w:val="22"/>
         </w:rPr>
         <w:t>Slide Lab is an add-on for Claude that turns your message, notes and numbers into a finished PowerPoint deck on your client's own template, with their colors, fonts and layouts. It helps you shape the storyline, shows you three designs for each slide to pick from, then builds the deck and checks every slide before you open it.</w:t>
       </w:r>
     </w:p>
     <w:p>
       <w:pPr>
+        <w:pStyle w:val="Heading1"/>
         <w:keepNext/>
-        <w:spacing w:before="200" w:after="60"/>
+        <w:spacing w:before="200" w:after="120" w:lineRule="exact" w:line="360"/>
       </w:pPr>
       <w:r>
         <w:rPr>
+          <w:rFonts w:ascii="Calibri" w:hAnsi="Calibri" w:eastAsia="Calibri"/>
           <w:b/>
           <w:color w:val="0B3C49"/>
-          <w:sz w:val="26"/>
+          <w:sz w:val="28"/>
         </w:rPr>
-        <w:t>2. Before you start: install three programs</w:t>
+        <w:t>Step 1. Install three programs yourself</w:t>
       </w:r>
+    </w:p>
+    <w:tbl>
+      <w:tblPr>
+        <w:tblW w:type="dxa" w:w="8208"/>
+        <w:jc w:val="left"/>
+        <w:tblLayout w:type="fixed"/>
+        <w:tblLook w:firstColumn="1" w:firstRow="1" w:lastColumn="0" w:lastRow="0" w:noHBand="0" w:noVBand="1" w:val="04A0"/>
+        <w:tblBorders>
+          <w:top w:val="nil" w:space="0"/>
+          <w:left w:val="single" w:sz="24" w:color="0B3C49" w:space="0"/>
+          <w:bottom w:val="nil" w:space="0"/>
+          <w:right w:val="nil" w:space="0"/>
+          <w:insideH w:val="nil" w:space="0"/>
+          <w:insideV w:val="nil" w:space="0"/>
+        </w:tblBorders>
+        <w:tblLayout w:type="fixed"/>
+        <w:tblInd w:w="180" w:type="dxa"/>
+      </w:tblPr>
+      <w:tblGrid>
+        <w:gridCol w:w="8208"/>
+      </w:tblGrid>
+      <w:tr>
+        <w:trPr>
+          <w:cantSplit/>
+        </w:trPr>
+        <w:tc>
+          <w:tcPr>
+            <w:tcW w:type="dxa" w:w="8208"/>
+            <w:shd w:val="clear" w:color="auto" w:fill="EEF2F3"/>
+            <w:tcMar>
+              <w:top w:w="80" w:type="dxa"/>
+              <w:start w:w="180" w:type="dxa"/>
+              <w:bottom w:w="80" w:type="dxa"/>
+              <w:end w:w="144" w:type="dxa"/>
+            </w:tcMar>
+          </w:tcPr>
+          <w:p>
+            <w:pPr>
+              <w:spacing w:after="0" w:lineRule="exact" w:line="300"/>
+            </w:pPr>
+            <w:r>
+              <w:rPr>
+                <w:b/>
+                <w:i w:val="0"/>
+                <w:color w:val="222222"/>
+                <w:sz w:val="22"/>
+              </w:rPr>
+              <w:t xml:space="preserve">Request LibreOffice on day one. </w:t>
+            </w:r>
+            <w:r>
+              <w:rPr>
+                <w:b w:val="0"/>
+                <w:i w:val="0"/>
+                <w:color w:val="222222"/>
+                <w:sz w:val="22"/>
+              </w:rPr>
+              <w:t>On company computers it can need approval.</w:t>
+            </w:r>
+          </w:p>
+        </w:tc>
+      </w:tr>
+    </w:tbl>
+    <w:p>
+      <w:pPr>
+        <w:spacing w:after="0" w:lineRule="exact" w:line="160"/>
+      </w:pPr>
     </w:p>
     <w:p>
       <w:pPr>
-        <w:spacing w:after="100" w:before="0" w:line="259" w:lineRule="auto"/>
+        <w:keepNext/>
+        <w:widowControl/>
+        <w:spacing w:before="0" w:after="120" w:lineRule="exact" w:line="300"/>
       </w:pPr>
       <w:r>
         <w:rPr>
+          <w:b w:val="0"/>
+          <w:i w:val="0"/>
           <w:color w:val="222222"/>
-          <w:sz w:val="21"/>
+          <w:sz w:val="22"/>
         </w:rPr>
         <w:t>Install these yourself from your company's software portal (Software Center, Self Service or similar). If you are not on a company computer, use the official sites.</w:t>
       </w:r>
     </w:p>
     <w:tbl>
       <w:tblPr>
-        <w:tblW w:type="dxa" w:w="9360"/>
+        <w:tblW w:type="dxa" w:w="8208"/>
         <w:jc w:val="left"/>
         <w:tblLayout w:type="fixed"/>
         <w:tblLook w:firstColumn="1" w:firstRow="1" w:lastColumn="0" w:lastRow="0" w:noHBand="0" w:noVBand="1" w:val="04A0"/>
         <w:tblBorders>
-          <w:top w:val="single" w:sz="4" w:color="BFC7CA" w:space="0"/>
-          <w:left w:val="single" w:sz="4" w:color="BFC7CA" w:space="0"/>
-          <w:bottom w:val="single" w:sz="4" w:color="BFC7CA" w:space="0"/>
-          <w:right w:val="single" w:sz="4" w:color="BFC7CA" w:space="0"/>
-          <w:insideH w:val="single" w:sz="4" w:color="BFC7CA" w:space="0"/>
-          <w:insideV w:val="single" w:sz="4" w:color="BFC7CA" w:space="0"/>
+          <w:top w:val="nil" w:space="0"/>
+          <w:left w:val="nil" w:space="0"/>
+          <w:bottom w:val="single" w:sz="4" w:color="C9D1D4" w:space="0"/>
+          <w:right w:val="nil" w:space="0"/>
+          <w:insideH w:val="single" w:sz="4" w:color="C9D1D4" w:space="0"/>
+          <w:insideV w:val="nil" w:space="0"/>
         </w:tblBorders>
         <w:tblLayout w:type="fixed"/>
+        <w:tblInd w:w="0" w:type="dxa"/>
       </w:tblPr>
       <w:tblGrid>
-        <w:gridCol w:w="2448"/>
-        <w:gridCol w:w="3528"/>
-        <w:gridCol w:w="3384"/>
+        <w:gridCol w:w="2088"/>
+        <w:gridCol w:w="3096"/>
+        <w:gridCol w:w="3024"/>
       </w:tblGrid>
       <w:tr>
+        <w:trPr>
+          <w:tblHeader/>
+          <w:cantSplit/>
+        </w:trPr>
         <w:tc>
           <w:tcPr>
-            <w:tcW w:type="dxa" w:w="2448"/>
-            <w:shd w:val="clear" w:color="auto" w:fill="0B3C49"/>
+            <w:tcW w:type="dxa" w:w="2088"/>
             <w:tcMar>
-              <w:top w:w="60" w:type="dxa"/>
+              <w:top w:w="40" w:type="dxa"/>
+              <w:start w:w="0" w:type="dxa"/>
               <w:bottom w:w="60" w:type="dxa"/>
-              <w:start w:w="100" w:type="dxa"/>
-              <w:end w:w="100" w:type="dxa"/>
+              <w:end w:w="144" w:type="dxa"/>
             </w:tcMar>
+            <w:tcBorders>
+              <w:bottom w:val="single" w:sz="8" w:color="0B3C49" w:space="0"/>
+            </w:tcBorders>
           </w:tcPr>
           <w:p>
             <w:pPr>
-              <w:spacing w:after="0"/>
+              <w:keepNext/>
+              <w:spacing w:after="0" w:lineRule="exact" w:line="260"/>
             </w:pPr>
             <w:r>
               <w:rPr>
                 <w:b/>
-                <w:color w:val="FFFFFF"/>
+                <w:i w:val="0"/>
+                <w:color w:val="0B3C49"/>
                 <w:sz w:val="20"/>
               </w:rPr>
               <w:t>Program</w:t>
@@ -147,23 +206,27 @@
         </w:tc>
         <w:tc>
           <w:tcPr>
-            <w:tcW w:type="dxa" w:w="3528"/>
-            <w:shd w:val="clear" w:color="auto" w:fill="0B3C49"/>
+            <w:tcW w:type="dxa" w:w="3096"/>
             <w:tcMar>
-              <w:top w:w="60" w:type="dxa"/>
+              <w:top w:w="40" w:type="dxa"/>
+              <w:start w:w="0" w:type="dxa"/>
               <w:bottom w:w="60" w:type="dxa"/>
-              <w:start w:w="100" w:type="dxa"/>
-              <w:end w:w="100" w:type="dxa"/>
+              <w:end w:w="144" w:type="dxa"/>
             </w:tcMar>
+            <w:tcBorders>
+              <w:bottom w:val="single" w:sz="8" w:color="0B3C49" w:space="0"/>
+            </w:tcBorders>
           </w:tcPr>
           <w:p>
             <w:pPr>
-              <w:spacing w:after="0"/>
+              <w:keepNext/>
+              <w:spacing w:after="0" w:lineRule="exact" w:line="260"/>
             </w:pPr>
             <w:r>
               <w:rPr>
                 <w:b/>
-                <w:color w:val="FFFFFF"/>
+                <w:i w:val="0"/>
+                <w:color w:val="0B3C49"/>
                 <w:sz w:val="20"/>
               </w:rPr>
               <w:t>Why Slide Lab needs it</w:t>
@@ -172,23 +235,27 @@
         </w:tc>
         <w:tc>
           <w:tcPr>
-            <w:tcW w:type="dxa" w:w="3384"/>
-            <w:shd w:val="clear" w:color="auto" w:fill="0B3C49"/>
+            <w:tcW w:type="dxa" w:w="3024"/>
             <w:tcMar>
-              <w:top w:w="60" w:type="dxa"/>
+              <w:top w:w="40" w:type="dxa"/>
+              <w:start w:w="0" w:type="dxa"/>
               <w:bottom w:w="60" w:type="dxa"/>
-              <w:start w:w="100" w:type="dxa"/>
-              <w:end w:w="100" w:type="dxa"/>
+              <w:end w:w="144" w:type="dxa"/>
             </w:tcMar>
+            <w:tcBorders>
+              <w:bottom w:val="single" w:sz="8" w:color="0B3C49" w:space="0"/>
+            </w:tcBorders>
           </w:tcPr>
           <w:p>
             <w:pPr>
-              <w:spacing w:after="0"/>
+              <w:keepNext/>
+              <w:spacing w:after="0" w:lineRule="exact" w:line="260"/>
             </w:pPr>
             <w:r>
               <w:rPr>
                 <w:b/>
-                <w:color w:val="FFFFFF"/>
+                <w:i w:val="0"/>
+                <w:color w:val="0B3C49"/>
                 <w:sz w:val="20"/>
               </w:rPr>
               <w:t>Where to get it</w:t>
@@ -202,17 +269,17 @@
         </w:trPr>
         <w:tc>
           <w:tcPr>
-            <w:tcW w:type="dxa" w:w="2448"/>
+            <w:tcW w:type="dxa" w:w="2088"/>
             <w:tcMar>
-              <w:top w:w="60" w:type="dxa"/>
-              <w:bottom w:w="60" w:type="dxa"/>
-              <w:start w:w="100" w:type="dxa"/>
-              <w:end w:w="100" w:type="dxa"/>
+              <w:top w:w="50" w:type="dxa"/>
+              <w:start w:w="0" w:type="dxa"/>
+              <w:bottom w:w="50" w:type="dxa"/>
+              <w:end w:w="144" w:type="dxa"/>
             </w:tcMar>
           </w:tcPr>
           <w:p>
             <w:pPr>
-              <w:spacing w:after="0" w:line="252" w:lineRule="auto"/>
+              <w:spacing w:after="0" w:lineRule="exact" w:line="260"/>
             </w:pPr>
             <w:r>
               <w:rPr>
@@ -227,20 +294,22 @@
         </w:tc>
         <w:tc>
           <w:tcPr>
-            <w:tcW w:type="dxa" w:w="3528"/>
+            <w:tcW w:type="dxa" w:w="3096"/>
             <w:tcMar>
-              <w:top w:w="60" w:type="dxa"/>
-              <w:bottom w:w="60" w:type="dxa"/>
-              <w:start w:w="100" w:type="dxa"/>
-              <w:end w:w="100" w:type="dxa"/>
+              <w:top w:w="50" w:type="dxa"/>
+              <w:start w:w="0" w:type="dxa"/>
+              <w:bottom w:w="50" w:type="dxa"/>
+              <w:end w:w="144" w:type="dxa"/>
             </w:tcMar>
           </w:tcPr>
           <w:p>
             <w:pPr>
-              <w:spacing w:after="0" w:line="252" w:lineRule="auto"/>
+              <w:spacing w:after="0" w:lineRule="exact" w:line="260"/>
             </w:pPr>
             <w:r>
               <w:rPr>
+                <w:b w:val="0"/>
+                <w:i w:val="0"/>
                 <w:color w:val="222222"/>
                 <w:sz w:val="20"/>
               </w:rPr>
@@ -250,20 +319,22 @@
         </w:tc>
         <w:tc>
           <w:tcPr>
-            <w:tcW w:type="dxa" w:w="3384"/>
+            <w:tcW w:type="dxa" w:w="3024"/>
             <w:tcMar>
-              <w:top w:w="60" w:type="dxa"/>
-              <w:bottom w:w="60" w:type="dxa"/>
-              <w:start w:w="100" w:type="dxa"/>
-              <w:end w:w="100" w:type="dxa"/>
+              <w:top w:w="50" w:type="dxa"/>
+              <w:start w:w="0" w:type="dxa"/>
+              <w:bottom w:w="50" w:type="dxa"/>
+              <w:end w:w="144" w:type="dxa"/>
             </w:tcMar>
           </w:tcPr>
           <w:p>
             <w:pPr>
-              <w:spacing w:after="0" w:line="252" w:lineRule="auto"/>
+              <w:spacing w:after="0" w:lineRule="exact" w:line="260"/>
             </w:pPr>
             <w:r>
               <w:rPr>
+                <w:b w:val="0"/>
+                <w:i w:val="0"/>
                 <w:color w:val="222222"/>
                 <w:sz w:val="20"/>
               </w:rPr>
@@ -275,6 +346,7 @@
                   <w:rFonts w:ascii="Calibri" w:hAnsi="Calibri"/>
                   <w:color w:val="0B3C49"/>
                   <w:u w:val="single"/>
+                  <w:sz w:val="20"/>
                 </w:rPr>
                 <w:t xml:space="preserve">claude.ai/code</w:t>
               </w:r>
@@ -288,17 +360,17 @@
         </w:trPr>
         <w:tc>
           <w:tcPr>
-            <w:tcW w:type="dxa" w:w="2448"/>
+            <w:tcW w:type="dxa" w:w="2088"/>
             <w:tcMar>
-              <w:top w:w="60" w:type="dxa"/>
-              <w:bottom w:w="60" w:type="dxa"/>
-              <w:start w:w="100" w:type="dxa"/>
-              <w:end w:w="100" w:type="dxa"/>
+              <w:top w:w="50" w:type="dxa"/>
+              <w:start w:w="0" w:type="dxa"/>
+              <w:bottom w:w="50" w:type="dxa"/>
+              <w:end w:w="144" w:type="dxa"/>
             </w:tcMar>
           </w:tcPr>
           <w:p>
             <w:pPr>
-              <w:spacing w:after="0" w:line="252" w:lineRule="auto"/>
+              <w:spacing w:after="0" w:lineRule="exact" w:line="260"/>
             </w:pPr>
             <w:r>
               <w:rPr>
@@ -313,20 +385,22 @@
         </w:tc>
         <w:tc>
           <w:tcPr>
-            <w:tcW w:type="dxa" w:w="3528"/>
+            <w:tcW w:type="dxa" w:w="3096"/>
             <w:tcMar>
-              <w:top w:w="60" w:type="dxa"/>
-              <w:bottom w:w="60" w:type="dxa"/>
-              <w:start w:w="100" w:type="dxa"/>
-              <w:end w:w="100" w:type="dxa"/>
+              <w:top w:w="50" w:type="dxa"/>
+              <w:start w:w="0" w:type="dxa"/>
+              <w:bottom w:w="50" w:type="dxa"/>
+              <w:end w:w="144" w:type="dxa"/>
             </w:tcMar>
           </w:tcPr>
           <w:p>
             <w:pPr>
-              <w:spacing w:after="0" w:line="252" w:lineRule="auto"/>
+              <w:spacing w:after="0" w:lineRule="exact" w:line="260"/>
             </w:pPr>
             <w:r>
               <w:rPr>
+                <w:b w:val="0"/>
+                <w:i w:val="0"/>
                 <w:color w:val="222222"/>
                 <w:sz w:val="20"/>
               </w:rPr>
@@ -336,20 +410,22 @@
         </w:tc>
         <w:tc>
           <w:tcPr>
-            <w:tcW w:type="dxa" w:w="3384"/>
+            <w:tcW w:type="dxa" w:w="3024"/>
             <w:tcMar>
-              <w:top w:w="60" w:type="dxa"/>
-              <w:bottom w:w="60" w:type="dxa"/>
-              <w:start w:w="100" w:type="dxa"/>
-              <w:end w:w="100" w:type="dxa"/>
+              <w:top w:w="50" w:type="dxa"/>
+              <w:start w:w="0" w:type="dxa"/>
+              <w:bottom w:w="50" w:type="dxa"/>
+              <w:end w:w="144" w:type="dxa"/>
             </w:tcMar>
           </w:tcPr>
           <w:p>
             <w:pPr>
-              <w:spacing w:after="0" w:line="252" w:lineRule="auto"/>
+              <w:spacing w:after="0" w:lineRule="exact" w:line="260"/>
             </w:pPr>
             <w:r>
               <w:rPr>
+                <w:b w:val="0"/>
+                <w:i w:val="0"/>
                 <w:color w:val="222222"/>
                 <w:sz w:val="20"/>
               </w:rPr>
@@ -361,6 +437,7 @@
                   <w:rFonts w:ascii="Calibri" w:hAnsi="Calibri"/>
                   <w:color w:val="0B3C49"/>
                   <w:u w:val="single"/>
+                  <w:sz w:val="20"/>
                 </w:rPr>
                 <w:t xml:space="preserve">python.org</w:t>
               </w:r>
@@ -374,17 +451,17 @@
         </w:trPr>
         <w:tc>
           <w:tcPr>
-            <w:tcW w:type="dxa" w:w="2448"/>
+            <w:tcW w:type="dxa" w:w="2088"/>
             <w:tcMar>
-              <w:top w:w="60" w:type="dxa"/>
-              <w:bottom w:w="60" w:type="dxa"/>
-              <w:start w:w="100" w:type="dxa"/>
-              <w:end w:w="100" w:type="dxa"/>
+              <w:top w:w="50" w:type="dxa"/>
+              <w:start w:w="0" w:type="dxa"/>
+              <w:bottom w:w="50" w:type="dxa"/>
+              <w:end w:w="144" w:type="dxa"/>
             </w:tcMar>
           </w:tcPr>
           <w:p>
             <w:pPr>
-              <w:spacing w:after="0" w:line="252" w:lineRule="auto"/>
+              <w:spacing w:after="0" w:lineRule="exact" w:line="260"/>
             </w:pPr>
             <w:r>
               <w:rPr>
@@ -399,20 +476,22 @@
         </w:tc>
         <w:tc>
           <w:tcPr>
-            <w:tcW w:type="dxa" w:w="3528"/>
+            <w:tcW w:type="dxa" w:w="3096"/>
             <w:tcMar>
-              <w:top w:w="60" w:type="dxa"/>
-              <w:bottom w:w="60" w:type="dxa"/>
-              <w:start w:w="100" w:type="dxa"/>
-              <w:end w:w="100" w:type="dxa"/>
+              <w:top w:w="50" w:type="dxa"/>
+              <w:start w:w="0" w:type="dxa"/>
+              <w:bottom w:w="50" w:type="dxa"/>
+              <w:end w:w="144" w:type="dxa"/>
             </w:tcMar>
           </w:tcPr>
           <w:p>
             <w:pPr>
-              <w:spacing w:after="0" w:line="252" w:lineRule="auto"/>
+              <w:spacing w:after="0" w:lineRule="exact" w:line="260"/>
             </w:pPr>
             <w:r>
               <w:rPr>
+                <w:b w:val="0"/>
+                <w:i w:val="0"/>
                 <w:color w:val="222222"/>
                 <w:sz w:val="20"/>
               </w:rPr>
@@ -422,20 +501,22 @@
         </w:tc>
         <w:tc>
           <w:tcPr>
-            <w:tcW w:type="dxa" w:w="3384"/>
+            <w:tcW w:type="dxa" w:w="3024"/>
             <w:tcMar>
-              <w:top w:w="60" w:type="dxa"/>
-              <w:bottom w:w="60" w:type="dxa"/>
-              <w:start w:w="100" w:type="dxa"/>
-              <w:end w:w="100" w:type="dxa"/>
+              <w:top w:w="50" w:type="dxa"/>
+              <w:start w:w="0" w:type="dxa"/>
+              <w:bottom w:w="50" w:type="dxa"/>
+              <w:end w:w="144" w:type="dxa"/>
             </w:tcMar>
           </w:tcPr>
           <w:p>
             <w:pPr>
-              <w:spacing w:after="0" w:line="252" w:lineRule="auto"/>
+              <w:spacing w:after="0" w:lineRule="exact" w:line="260"/>
             </w:pPr>
             <w:r>
               <w:rPr>
+                <w:b w:val="0"/>
+                <w:i w:val="0"/>
                 <w:color w:val="222222"/>
                 <w:sz w:val="20"/>
               </w:rPr>
@@ -447,101 +528,211 @@
                   <w:rFonts w:ascii="Calibri" w:hAnsi="Calibri"/>
                   <w:color w:val="0B3C49"/>
                   <w:u w:val="single"/>
+                  <w:sz w:val="20"/>
                 </w:rPr>
                 <w:t xml:space="preserve">libreoffice.org</w:t>
               </w:r>
             </w:hyperlink>
-            <w:r>
-              <w:rPr>
-                <w:color w:val="222222"/>
-                <w:sz w:val="20"/>
-              </w:rPr>
-              <w:t xml:space="preserve">. </w:t>
-            </w:r>
-            <w:r>
-              <w:rPr>
-                <w:b/>
-                <w:i w:val="0"/>
-                <w:color w:val="222222"/>
-                <w:sz w:val="20"/>
-              </w:rPr>
-              <w:t>Request it on day one:</w:t>
-            </w:r>
-            <w:r>
-              <w:rPr>
-                <w:color w:val="222222"/>
-                <w:sz w:val="20"/>
-              </w:rPr>
-              <w:t xml:space="preserve"> on company computers it can need approval</w:t>
-            </w:r>
           </w:p>
         </w:tc>
       </w:tr>
     </w:tbl>
     <w:p>
       <w:pPr>
-        <w:spacing w:after="0" w:line="120" w:lineRule="exact"/>
+        <w:spacing w:after="0" w:lineRule="exact" w:line="120"/>
       </w:pPr>
     </w:p>
     <w:p>
       <w:pPr>
-        <w:spacing w:after="40" w:before="0" w:line="259" w:lineRule="auto"/>
+        <w:pStyle w:val="Heading1"/>
+        <w:keepNext/>
+        <w:spacing w:before="240" w:after="120" w:lineRule="exact" w:line="360"/>
       </w:pPr>
       <w:r>
         <w:rPr>
-          <w:color w:val="222222"/>
-          <w:sz w:val="21"/>
+          <w:rFonts w:ascii="Calibri" w:hAnsi="Calibri" w:eastAsia="Calibri"/>
+          <w:b/>
+          <w:color w:val="0B3C49"/>
+          <w:sz w:val="28"/>
         </w:rPr>
-        <w:t xml:space="preserve">Git (a download tool Slide Lab uses) is usually already there, because Claude Code on Windows uses it. If the setup check later says it is missing, get it from the portal or </w:t>
-      </w:r>
-      <w:hyperlink r:id="rId13">
-        <w:r>
-          <w:rPr>
-            <w:rFonts w:ascii="Calibri" w:hAnsi="Calibri"/>
-            <w:color w:val="0B3C49"/>
-            <w:u w:val="single"/>
-          </w:rPr>
-          <w:t xml:space="preserve">git-scm.com</w:t>
-        </w:r>
-      </w:hyperlink>
-      <w:r>
-        <w:rPr>
-          <w:color w:val="222222"/>
-          <w:sz w:val="21"/>
-        </w:rPr>
-        <w:t>.</w:t>
+        <w:t>Step 2. Let Claude do the rest</w:t>
       </w:r>
     </w:p>
     <w:p>
       <w:pPr>
         <w:keepNext/>
-        <w:spacing w:before="200" w:after="60"/>
+        <w:widowControl/>
+        <w:spacing w:before="0" w:after="120" w:lineRule="exact" w:line="300"/>
+      </w:pPr>
+      <w:r>
+        <w:rPr>
+          <w:b w:val="0"/>
+          <w:i w:val="0"/>
+          <w:color w:val="222222"/>
+          <w:sz w:val="22"/>
+        </w:rPr>
+        <w:t>Open Claude (desktop app or Claude Code) and paste this request exactly as written.</w:t>
+      </w:r>
+    </w:p>
+    <w:p>
+      <w:pPr>
+        <w:keepNext/>
+        <w:widowControl/>
+        <w:spacing w:before="0" w:after="60" w:lineRule="exact" w:line="260"/>
       </w:pPr>
       <w:r>
         <w:rPr>
           <w:b/>
+          <w:i w:val="0"/>
           <w:color w:val="0B3C49"/>
-          <w:sz w:val="26"/>
+          <w:sz w:val="20"/>
         </w:rPr>
-        <w:t>3. Let Claude do the rest</w:t>
+        <w:t>Copy all of this into Claude (it is one long line)</w:t>
       </w:r>
     </w:p>
     <w:p>
       <w:pPr>
-        <w:pStyle w:val="ListNumber"/>
-        <w:spacing w:after="80" w:line="259" w:lineRule="auto"/>
+        <w:keepLines/>
+        <w:spacing w:before="0" w:after="160" w:lineRule="exact" w:line="280"/>
+        <w:ind w:left="180" w:right="180"/>
+        <w:pBdr>
+          <w:top w:val="single" w:sz="6" w:space="6" w:color="0B3C49"/>
+          <w:left w:val="single" w:sz="6" w:space="8" w:color="0B3C49"/>
+          <w:bottom w:val="single" w:sz="6" w:space="6" w:color="0B3C49"/>
+          <w:right w:val="single" w:sz="6" w:space="8" w:color="0B3C49"/>
+        </w:pBdr>
+        <w:shd w:val="clear" w:color="auto" w:fill="F5F7F8"/>
       </w:pPr>
       <w:r>
         <w:rPr>
+          <w:rFonts w:ascii="Consolas" w:hAnsi="Consolas" w:eastAsia="Consolas"/>
           <w:color w:val="222222"/>
-          <w:sz w:val="21"/>
+          <w:sz w:val="20"/>
         </w:rPr>
-        <w:t>Open Claude and paste this request exactly as written:</w:t>
+        <w:t>Install Slide Lab for me. Clone https://github.com/mperaltajr/skills into my .claude\skills folder (~/.claude/skills on a Mac), then follow the "Doing it by hand" steps in its README.md for my computer. Run each command on its own so I can approve it, and finish by running doctor.py and showing me its table.</w:t>
+      </w:r>
+    </w:p>
+    <w:p>
+      <w:pPr>
+        <w:keepNext w:val="0"/>
+        <w:widowControl/>
+        <w:spacing w:before="0" w:after="120" w:lineRule="exact" w:line="300"/>
+      </w:pPr>
+      <w:r>
+        <w:rPr>
+          <w:b w:val="0"/>
+          <w:i w:val="0"/>
+          <w:color w:val="222222"/>
+          <w:sz w:val="22"/>
+        </w:rPr>
+        <w:t xml:space="preserve">Claude asks before each download or install (your company's settings may require that). Click </w:t>
+      </w:r>
+      <w:r>
+        <w:rPr>
+          <w:b/>
+          <w:i w:val="0"/>
+          <w:color w:val="222222"/>
+          <w:sz w:val="22"/>
+        </w:rPr>
+        <w:t>Allow</w:t>
+      </w:r>
+      <w:r>
+        <w:rPr>
+          <w:b w:val="0"/>
+          <w:i w:val="0"/>
+          <w:color w:val="222222"/>
+          <w:sz w:val="22"/>
+        </w:rPr>
+        <w:t xml:space="preserve"> each time.</w:t>
+      </w:r>
+    </w:p>
+    <w:p>
+      <w:pPr>
+        <w:keepNext w:val="0"/>
+        <w:widowControl/>
+        <w:spacing w:before="0" w:after="0" w:lineRule="exact" w:line="300"/>
+      </w:pPr>
+      <w:r>
+        <w:rPr>
+          <w:b w:val="0"/>
+          <w:i w:val="0"/>
+          <w:color w:val="222222"/>
+          <w:sz w:val="22"/>
+        </w:rPr>
+        <w:t>At the end Claude shows a setup table. If every piece is OK, the last line reads "Slide Lab is ready." Any row that is not OK says exactly what to do.</w:t>
+      </w:r>
+    </w:p>
+    <w:p>
+      <w:pPr>
+        <w:pStyle w:val="Heading1"/>
+        <w:keepNext/>
+        <w:spacing w:before="240" w:after="120" w:lineRule="exact" w:line="360"/>
+      </w:pPr>
+      <w:r>
+        <w:rPr>
+          <w:rFonts w:ascii="Calibri" w:hAnsi="Calibri" w:eastAsia="Calibri"/>
+          <w:b/>
+          <w:color w:val="0B3C49"/>
+          <w:sz w:val="28"/>
+        </w:rPr>
+        <w:t>Step 3. Restart Claude</w:t>
+      </w:r>
+    </w:p>
+    <w:p>
+      <w:pPr>
+        <w:keepNext w:val="0"/>
+        <w:widowControl/>
+        <w:spacing w:before="0" w:after="0" w:lineRule="exact" w:line="300"/>
+      </w:pPr>
+      <w:r>
+        <w:rPr>
+          <w:b w:val="0"/>
+          <w:i w:val="0"/>
+          <w:color w:val="222222"/>
+          <w:sz w:val="22"/>
+        </w:rPr>
+        <w:t xml:space="preserve">Close and reopen Claude so it loads Slide Lab. Then type </w:t>
+      </w:r>
+      <w:r>
+        <w:rPr>
+          <w:b/>
+          <w:i w:val="0"/>
+          <w:color w:val="222222"/>
+          <w:sz w:val="22"/>
+        </w:rPr>
+        <w:t>/slide-lab</w:t>
+      </w:r>
+      <w:r>
+        <w:rPr>
+          <w:b w:val="0"/>
+          <w:i w:val="0"/>
+          <w:color w:val="222222"/>
+          <w:sz w:val="22"/>
+        </w:rPr>
+        <w:t xml:space="preserve"> or just ask for a deck.</w:t>
+      </w:r>
+    </w:p>
+    <w:p>
+      <w:pPr>
+        <w:pStyle w:val="Heading1"/>
+        <w:keepNext/>
+        <w:pageBreakBefore/>
+        <w:spacing w:before="0" w:after="120" w:lineRule="exact" w:line="360"/>
+      </w:pPr>
+      <w:r>
+        <w:rPr>
+          <w:rFonts w:ascii="Calibri" w:hAnsi="Calibri" w:eastAsia="Calibri"/>
+          <w:b/>
+          <w:color w:val="0B3C49"/>
+          <w:sz w:val="28"/>
+        </w:rPr>
+        <w:t>Your first deck</w:t>
       </w:r>
     </w:p>
     <w:tbl>
       <w:tblPr>
-        <w:tblW w:type="dxa" w:w="9360"/>
+        <w:tblW w:type="dxa" w:w="8208"/>
+        <w:jc w:val="left"/>
         <w:tblLayout w:type="fixed"/>
         <w:tblLook w:firstColumn="1" w:firstRow="1" w:lastColumn="0" w:lastRow="0" w:noHBand="0" w:noVBand="1" w:val="04A0"/>
         <w:tblBorders>
@@ -553,33 +744,70 @@
           <w:insideV w:val="nil" w:space="0"/>
         </w:tblBorders>
         <w:tblLayout w:type="fixed"/>
+        <w:tblInd w:w="180" w:type="dxa"/>
       </w:tblPr>
       <w:tblGrid>
-        <w:gridCol w:w="9360"/>
+        <w:gridCol w:w="8208"/>
       </w:tblGrid>
       <w:tr>
+        <w:trPr>
+          <w:cantSplit/>
+        </w:trPr>
         <w:tc>
           <w:tcPr>
-            <w:tcW w:type="dxa" w:w="9360"/>
+            <w:tcW w:type="dxa" w:w="8208"/>
             <w:shd w:val="clear" w:color="auto" w:fill="EEF2F3"/>
             <w:tcMar>
-              <w:top w:w="100" w:type="dxa"/>
-              <w:bottom w:w="100" w:type="dxa"/>
-              <w:start w:w="160" w:type="dxa"/>
-              <w:end w:w="160" w:type="dxa"/>
+              <w:top w:w="80" w:type="dxa"/>
+              <w:start w:w="180" w:type="dxa"/>
+              <w:bottom w:w="80" w:type="dxa"/>
+              <w:end w:w="144" w:type="dxa"/>
             </w:tcMar>
           </w:tcPr>
           <w:p>
             <w:pPr>
-              <w:spacing w:after="0" w:line="264" w:lineRule="auto"/>
+              <w:spacing w:after="0" w:lineRule="exact" w:line="300"/>
             </w:pPr>
             <w:r>
               <w:rPr>
-                <w:rFonts w:ascii="Consolas" w:hAnsi="Consolas" w:eastAsia="Consolas"/>
+                <w:b/>
+                <w:i w:val="0"/>
                 <w:color w:val="222222"/>
-                <w:sz w:val="19"/>
+                <w:sz w:val="22"/>
               </w:rPr>
-              <w:t>Install Slide Lab for me. Clone https://github.com/mperaltajr/skills into my .claude\skills folder (~/.claude/skills on a Mac), then follow the "Doing it by hand" steps in its README.md for my computer. Run each command on its own so I can approve it, and finish by running doctor.py and showing me its table.</w:t>
+              <w:t xml:space="preserve">Keep your work out of OneDrive. </w:t>
+            </w:r>
+            <w:r>
+              <w:rPr>
+                <w:b w:val="0"/>
+                <w:i w:val="0"/>
+                <w:color w:val="222222"/>
+                <w:sz w:val="22"/>
+              </w:rPr>
+              <w:t>Work in this folder on your own drive:</w:t>
+            </w:r>
+            <w:r>
+              <w:br/>
+            </w:r>
+            <w:r>
+              <w:rPr>
+                <w:b/>
+                <w:color w:val="222222"/>
+                <w:sz w:val="22"/>
+              </w:rPr>
+              <w:t>C:\Users\&lt;you&gt;\Slide Lab\sessions\&lt;Client&gt;\</w:t>
+            </w:r>
+            <w:r>
+              <w:br/>
+            </w:r>
+            <w:r>
+              <w:rPr>
+                <w:b w:val="0"/>
+                <w:i w:val="0"/>
+                <w:color w:val="222222"/>
+                <w:sz w:val="22"/>
+              </w:rPr>
+              <w:t>The setup creates it, with a Desktop shortcut. Syncing hundreds of working files slowed builds from about 4 minutes per page to 9 to 20 and made previews time out. Copy finished decks to OneDrive or SharePoint.</w:t>
             </w:r>
           </w:p>
         </w:tc>
@@ -587,325 +815,47 @@
     </w:tbl>
     <w:p>
       <w:pPr>
-        <w:spacing w:after="0" w:line="120" w:lineRule="exact"/>
+        <w:spacing w:after="0" w:lineRule="exact" w:line="160"/>
       </w:pPr>
-    </w:p>
-    <w:p>
-      <w:pPr>
-        <w:pStyle w:val="ListNumber"/>
-        <w:spacing w:after="40" w:line="259" w:lineRule="auto"/>
-      </w:pPr>
-      <w:r>
-        <w:rPr>
-          <w:color w:val="222222"/>
-          <w:sz w:val="21"/>
-        </w:rPr>
-        <w:t xml:space="preserve">Claude asks before each download or install (your company's settings may require that). Click </w:t>
-      </w:r>
-      <w:r>
-        <w:rPr>
-          <w:b/>
-          <w:i w:val="0"/>
-          <w:color w:val="222222"/>
-          <w:sz w:val="21"/>
-        </w:rPr>
-        <w:t>Allow</w:t>
-      </w:r>
-      <w:r>
-        <w:rPr>
-          <w:color w:val="222222"/>
-          <w:sz w:val="21"/>
-        </w:rPr>
-        <w:t xml:space="preserve"> each time.</w:t>
-      </w:r>
-    </w:p>
-    <w:p>
-      <w:pPr>
-        <w:pStyle w:val="ListNumber"/>
-        <w:spacing w:after="40" w:line="259" w:lineRule="auto"/>
-      </w:pPr>
-      <w:r>
-        <w:rPr>
-          <w:color w:val="222222"/>
-          <w:sz w:val="21"/>
-        </w:rPr>
-        <w:t>At the end Claude shows a setup table listing each piece as OK or not. Any row that is not OK says exactly what to do.</w:t>
-      </w:r>
-    </w:p>
-    <w:p>
-      <w:pPr>
-        <w:pStyle w:val="ListNumber"/>
-        <w:spacing w:after="80" w:line="259" w:lineRule="auto"/>
-      </w:pPr>
-      <w:r>
-        <w:rPr>
-          <w:b/>
-          <w:i w:val="0"/>
-          <w:color w:val="222222"/>
-          <w:sz w:val="21"/>
-        </w:rPr>
-        <w:t>Restart Claude</w:t>
-      </w:r>
-      <w:r>
-        <w:rPr>
-          <w:color w:val="222222"/>
-          <w:sz w:val="21"/>
-        </w:rPr>
-        <w:t xml:space="preserve"> (close it and open it again) so it loads Slide Lab. Then type /slide-lab or just ask for a deck.</w:t>
-      </w:r>
-    </w:p>
-    <w:p>
-      <w:pPr>
-        <w:spacing w:after="40" w:before="0" w:line="259" w:lineRule="auto"/>
-      </w:pPr>
-      <w:r>
-        <w:rPr>
-          <w:b/>
-          <w:i w:val="0"/>
-          <w:color w:val="222222"/>
-          <w:sz w:val="21"/>
-        </w:rPr>
-        <w:t xml:space="preserve">Prefer to type the commands yourself? </w:t>
-      </w:r>
-      <w:r>
-        <w:rPr>
-          <w:color w:val="222222"/>
-          <w:sz w:val="21"/>
-        </w:rPr>
-        <w:t xml:space="preserve">See the Install section of README.md in the Slide Lab folder or at </w:t>
-      </w:r>
-      <w:hyperlink r:id="rId14">
-        <w:r>
-          <w:rPr>
-            <w:rFonts w:ascii="Calibri" w:hAnsi="Calibri"/>
-            <w:color w:val="0B3C49"/>
-            <w:u w:val="single"/>
-          </w:rPr>
-          <w:t xml:space="preserve">https://github.com/mperaltajr/skills</w:t>
-        </w:r>
-      </w:hyperlink>
-      <w:r>
-        <w:rPr>
-          <w:color w:val="222222"/>
-          <w:sz w:val="21"/>
-        </w:rPr>
-        <w:t>.</w:t>
-      </w:r>
-    </w:p>
-    <w:p>
-      <w:pPr>
-        <w:keepNext/>
-        <w:spacing w:before="200" w:after="60"/>
-      </w:pPr>
-      <w:r>
-        <w:rPr>
-          <w:b/>
-          <w:color w:val="0B3C49"/>
-          <w:sz w:val="26"/>
-        </w:rPr>
-        <w:t>4. How long it takes</w:t>
-      </w:r>
-    </w:p>
-    <w:p>
-      <w:pPr>
-        <w:spacing w:after="80" w:before="0" w:line="259" w:lineRule="auto"/>
-      </w:pPr>
-      <w:r>
-        <w:rPr>
-          <w:color w:val="222222"/>
-          <w:sz w:val="21"/>
-        </w:rPr>
-        <w:t>About 20 to 45 minutes the first time, plus however long the software portal takes to approve and install LibreOffice.</w:t>
-      </w:r>
-    </w:p>
-    <w:p>
-      <w:pPr>
-        <w:keepNext/>
-        <w:spacing w:before="200" w:after="60"/>
-      </w:pPr>
-      <w:r>
-        <w:rPr>
-          <w:b/>
-          <w:color w:val="0B3C49"/>
-          <w:sz w:val="26"/>
-        </w:rPr>
-        <w:t>5. Getting up and running</w:t>
-      </w:r>
     </w:p>
     <w:tbl>
       <w:tblPr>
-        <w:tblW w:type="dxa" w:w="9360"/>
+        <w:tblW w:type="dxa" w:w="8208"/>
         <w:jc w:val="left"/>
         <w:tblLayout w:type="fixed"/>
         <w:tblLook w:firstColumn="1" w:firstRow="1" w:lastColumn="0" w:lastRow="0" w:noHBand="0" w:noVBand="1" w:val="04A0"/>
         <w:tblBorders>
-          <w:top w:val="single" w:sz="4" w:color="BFC7CA" w:space="0"/>
-          <w:left w:val="single" w:sz="4" w:color="BFC7CA" w:space="0"/>
-          <w:bottom w:val="single" w:sz="4" w:color="BFC7CA" w:space="0"/>
-          <w:right w:val="single" w:sz="4" w:color="BFC7CA" w:space="0"/>
-          <w:insideH w:val="single" w:sz="4" w:color="BFC7CA" w:space="0"/>
-          <w:insideV w:val="single" w:sz="4" w:color="BFC7CA" w:space="0"/>
+          <w:top w:val="nil" w:space="0"/>
+          <w:left w:val="nil" w:space="0"/>
+          <w:bottom w:val="single" w:sz="4" w:color="C9D1D4" w:space="0"/>
+          <w:right w:val="nil" w:space="0"/>
+          <w:insideH w:val="single" w:sz="4" w:color="C9D1D4" w:space="0"/>
+          <w:insideV w:val="nil" w:space="0"/>
         </w:tblBorders>
         <w:tblLayout w:type="fixed"/>
+        <w:tblInd w:w="0" w:type="dxa"/>
       </w:tblPr>
       <w:tblGrid>
-        <w:gridCol w:w="2448"/>
-        <w:gridCol w:w="6912"/>
+        <w:gridCol w:w="2088"/>
+        <w:gridCol w:w="6120"/>
       </w:tblGrid>
-      <w:tr>
-        <w:tc>
-          <w:tcPr>
-            <w:tcW w:type="dxa" w:w="2448"/>
-            <w:shd w:val="clear" w:color="auto" w:fill="0B3C49"/>
-            <w:tcMar>
-              <w:top w:w="60" w:type="dxa"/>
-              <w:bottom w:w="60" w:type="dxa"/>
-              <w:start w:w="100" w:type="dxa"/>
-              <w:end w:w="100" w:type="dxa"/>
-            </w:tcMar>
-          </w:tcPr>
-          <w:p>
-            <w:pPr>
-              <w:spacing w:after="0"/>
-            </w:pPr>
-            <w:r>
-              <w:rPr>
-                <w:b/>
-                <w:color w:val="FFFFFF"/>
-                <w:sz w:val="20"/>
-              </w:rPr>
-              <w:t>Topic</w:t>
-            </w:r>
-          </w:p>
-        </w:tc>
-        <w:tc>
-          <w:tcPr>
-            <w:tcW w:type="dxa" w:w="6912"/>
-            <w:shd w:val="clear" w:color="auto" w:fill="0B3C49"/>
-            <w:tcMar>
-              <w:top w:w="60" w:type="dxa"/>
-              <w:bottom w:w="60" w:type="dxa"/>
-              <w:start w:w="100" w:type="dxa"/>
-              <w:end w:w="100" w:type="dxa"/>
-            </w:tcMar>
-          </w:tcPr>
-          <w:p>
-            <w:pPr>
-              <w:spacing w:after="0"/>
-            </w:pPr>
-            <w:r>
-              <w:rPr>
-                <w:b/>
-                <w:color w:val="FFFFFF"/>
-                <w:sz w:val="20"/>
-              </w:rPr>
-              <w:t>What to know</w:t>
-            </w:r>
-          </w:p>
-        </w:tc>
-      </w:tr>
       <w:tr>
         <w:trPr>
           <w:cantSplit/>
         </w:trPr>
         <w:tc>
           <w:tcPr>
-            <w:tcW w:type="dxa" w:w="2448"/>
+            <w:tcW w:type="dxa" w:w="2088"/>
             <w:tcMar>
-              <w:top w:w="60" w:type="dxa"/>
-              <w:bottom w:w="60" w:type="dxa"/>
-              <w:start w:w="100" w:type="dxa"/>
-              <w:end w:w="100" w:type="dxa"/>
+              <w:top w:w="50" w:type="dxa"/>
+              <w:start w:w="0" w:type="dxa"/>
+              <w:bottom w:w="50" w:type="dxa"/>
+              <w:end w:w="144" w:type="dxa"/>
             </w:tcMar>
           </w:tcPr>
           <w:p>
             <w:pPr>
-              <w:spacing w:after="0" w:line="252" w:lineRule="auto"/>
-            </w:pPr>
-            <w:r>
-              <w:rPr>
-                <w:b/>
-                <w:i w:val="0"/>
-                <w:color w:val="222222"/>
-                <w:sz w:val="20"/>
-              </w:rPr>
-              <w:t>Where to keep your work</w:t>
-            </w:r>
-          </w:p>
-        </w:tc>
-        <w:tc>
-          <w:tcPr>
-            <w:tcW w:type="dxa" w:w="6912"/>
-            <w:tcMar>
-              <w:top w:w="60" w:type="dxa"/>
-              <w:bottom w:w="60" w:type="dxa"/>
-              <w:start w:w="100" w:type="dxa"/>
-              <w:end w:w="100" w:type="dxa"/>
-            </w:tcMar>
-          </w:tcPr>
-          <w:p>
-            <w:pPr>
-              <w:spacing w:after="0" w:line="252" w:lineRule="auto"/>
-            </w:pPr>
-            <w:r>
-              <w:rPr>
-                <w:color w:val="222222"/>
-                <w:sz w:val="20"/>
-              </w:rPr>
-              <w:t xml:space="preserve">Work in a folder on your own drive, </w:t>
-            </w:r>
-            <w:r>
-              <w:rPr>
-                <w:b/>
-                <w:i w:val="0"/>
-                <w:color w:val="222222"/>
-                <w:sz w:val="20"/>
-              </w:rPr>
-              <w:t>C:\Users\&lt;you&gt;\Slide Lab\sessions\&lt;Client&gt;\</w:t>
-            </w:r>
-            <w:r>
-              <w:rPr>
-                <w:color w:val="222222"/>
-                <w:sz w:val="20"/>
-              </w:rPr>
-              <w:t xml:space="preserve"> (the setup creates it, with a Desktop shortcut). </w:t>
-            </w:r>
-            <w:r>
-              <w:rPr>
-                <w:b/>
-                <w:i w:val="0"/>
-                <w:color w:val="222222"/>
-                <w:sz w:val="20"/>
-              </w:rPr>
-              <w:t>Not in OneDrive:</w:t>
-            </w:r>
-            <w:r>
-              <w:rPr>
-                <w:color w:val="222222"/>
-                <w:sz w:val="20"/>
-              </w:rPr>
-              <w:t xml:space="preserve"> syncing hundreds of working files slowed builds from about 4 minutes per page to 9 to 20 and made previews time out. Copy finished decks to OneDrive or SharePoint.</w:t>
-            </w:r>
-          </w:p>
-        </w:tc>
-      </w:tr>
-      <w:tr>
-        <w:trPr>
-          <w:cantSplit/>
-        </w:trPr>
-        <w:tc>
-          <w:tcPr>
-            <w:tcW w:type="dxa" w:w="2448"/>
-            <w:tcMar>
-              <w:top w:w="60" w:type="dxa"/>
-              <w:bottom w:w="60" w:type="dxa"/>
-              <w:start w:w="100" w:type="dxa"/>
-              <w:end w:w="100" w:type="dxa"/>
-            </w:tcMar>
-          </w:tcPr>
-          <w:p>
-            <w:pPr>
-              <w:spacing w:after="0" w:line="252" w:lineRule="auto"/>
+              <w:spacing w:after="0" w:lineRule="exact" w:line="260"/>
             </w:pPr>
             <w:r>
               <w:rPr>
@@ -920,24 +870,26 @@
         </w:tc>
         <w:tc>
           <w:tcPr>
-            <w:tcW w:type="dxa" w:w="6912"/>
+            <w:tcW w:type="dxa" w:w="6120"/>
             <w:tcMar>
-              <w:top w:w="60" w:type="dxa"/>
-              <w:bottom w:w="60" w:type="dxa"/>
-              <w:start w:w="100" w:type="dxa"/>
-              <w:end w:w="100" w:type="dxa"/>
+              <w:top w:w="50" w:type="dxa"/>
+              <w:start w:w="0" w:type="dxa"/>
+              <w:bottom w:w="50" w:type="dxa"/>
+              <w:end w:w="144" w:type="dxa"/>
             </w:tcMar>
           </w:tcPr>
           <w:p>
             <w:pPr>
-              <w:spacing w:after="0" w:line="252" w:lineRule="auto"/>
+              <w:spacing w:after="0" w:lineRule="exact" w:line="260"/>
             </w:pPr>
             <w:r>
               <w:rPr>
+                <w:b w:val="0"/>
+                <w:i w:val="0"/>
                 <w:color w:val="222222"/>
                 <w:sz w:val="20"/>
               </w:rPr>
-              <w:t>It can live anywhere, but must be 16:9 at 13.333 x 7.5 inches (PowerPoint's standard widescreen). Register each template once, about 5 to 10 minutes: Claude asks which colors are the main, highlight and cover colors and which layouts to use, then you open one sample slide in PowerPoint and confirm it looks right. Your original file is never changed.</w:t>
+              <w:t>It can live anywhere, but must be 16:9 at 13.333 x 7.5 inches (PowerPoint's standard widescreen). Register each template once, about 5 to 10 minutes. Claude asks which colors are the main, highlight and cover colors and which layouts to use, then you open one sample slide in PowerPoint and confirm it looks right. Your original file is never changed.</w:t>
             </w:r>
           </w:p>
         </w:tc>
@@ -948,17 +900,17 @@
         </w:trPr>
         <w:tc>
           <w:tcPr>
-            <w:tcW w:type="dxa" w:w="2448"/>
+            <w:tcW w:type="dxa" w:w="2088"/>
             <w:tcMar>
-              <w:top w:w="60" w:type="dxa"/>
-              <w:bottom w:w="60" w:type="dxa"/>
-              <w:start w:w="100" w:type="dxa"/>
-              <w:end w:w="100" w:type="dxa"/>
+              <w:top w:w="50" w:type="dxa"/>
+              <w:start w:w="0" w:type="dxa"/>
+              <w:bottom w:w="50" w:type="dxa"/>
+              <w:end w:w="144" w:type="dxa"/>
             </w:tcMar>
           </w:tcPr>
           <w:p>
             <w:pPr>
-              <w:spacing w:after="0" w:line="252" w:lineRule="auto"/>
+              <w:spacing w:after="0" w:lineRule="exact" w:line="260"/>
             </w:pPr>
             <w:r>
               <w:rPr>
@@ -967,26 +919,28 @@
                 <w:color w:val="222222"/>
                 <w:sz w:val="20"/>
               </w:rPr>
-              <w:t>Your first deck</w:t>
+              <w:t>Start small</w:t>
             </w:r>
           </w:p>
         </w:tc>
         <w:tc>
           <w:tcPr>
-            <w:tcW w:type="dxa" w:w="6912"/>
+            <w:tcW w:type="dxa" w:w="6120"/>
             <w:tcMar>
-              <w:top w:w="60" w:type="dxa"/>
-              <w:bottom w:w="60" w:type="dxa"/>
-              <w:start w:w="100" w:type="dxa"/>
-              <w:end w:w="100" w:type="dxa"/>
+              <w:top w:w="50" w:type="dxa"/>
+              <w:start w:w="0" w:type="dxa"/>
+              <w:bottom w:w="50" w:type="dxa"/>
+              <w:end w:w="144" w:type="dxa"/>
             </w:tcMar>
           </w:tcPr>
           <w:p>
             <w:pPr>
-              <w:spacing w:after="0" w:line="252" w:lineRule="auto"/>
+              <w:spacing w:after="0" w:lineRule="exact" w:line="260"/>
             </w:pPr>
             <w:r>
               <w:rPr>
+                <w:b w:val="0"/>
+                <w:i w:val="0"/>
                 <w:color w:val="222222"/>
                 <w:sz w:val="20"/>
               </w:rPr>
@@ -1001,17 +955,17 @@
         </w:trPr>
         <w:tc>
           <w:tcPr>
-            <w:tcW w:type="dxa" w:w="2448"/>
+            <w:tcW w:type="dxa" w:w="2088"/>
             <w:tcMar>
-              <w:top w:w="60" w:type="dxa"/>
-              <w:bottom w:w="60" w:type="dxa"/>
-              <w:start w:w="100" w:type="dxa"/>
-              <w:end w:w="100" w:type="dxa"/>
+              <w:top w:w="50" w:type="dxa"/>
+              <w:start w:w="0" w:type="dxa"/>
+              <w:bottom w:w="50" w:type="dxa"/>
+              <w:end w:w="144" w:type="dxa"/>
             </w:tcMar>
           </w:tcPr>
           <w:p>
             <w:pPr>
-              <w:spacing w:after="0" w:line="252" w:lineRule="auto"/>
+              <w:spacing w:after="0" w:lineRule="exact" w:line="260"/>
             </w:pPr>
             <w:r>
               <w:rPr>
@@ -1026,20 +980,22 @@
         </w:tc>
         <w:tc>
           <w:tcPr>
-            <w:tcW w:type="dxa" w:w="6912"/>
+            <w:tcW w:type="dxa" w:w="6120"/>
             <w:tcMar>
-              <w:top w:w="60" w:type="dxa"/>
-              <w:bottom w:w="60" w:type="dxa"/>
-              <w:start w:w="100" w:type="dxa"/>
-              <w:end w:w="100" w:type="dxa"/>
+              <w:top w:w="50" w:type="dxa"/>
+              <w:start w:w="0" w:type="dxa"/>
+              <w:bottom w:w="50" w:type="dxa"/>
+              <w:end w:w="144" w:type="dxa"/>
             </w:tcMar>
           </w:tcPr>
           <w:p>
             <w:pPr>
-              <w:spacing w:after="0" w:line="252" w:lineRule="auto"/>
+              <w:spacing w:after="0" w:lineRule="exact" w:line="260"/>
             </w:pPr>
             <w:r>
               <w:rPr>
+                <w:b w:val="0"/>
+                <w:i w:val="0"/>
                 <w:color w:val="222222"/>
                 <w:sz w:val="20"/>
               </w:rPr>
@@ -1054,17 +1010,17 @@
         </w:trPr>
         <w:tc>
           <w:tcPr>
-            <w:tcW w:type="dxa" w:w="2448"/>
+            <w:tcW w:type="dxa" w:w="2088"/>
             <w:tcMar>
-              <w:top w:w="60" w:type="dxa"/>
-              <w:bottom w:w="60" w:type="dxa"/>
-              <w:start w:w="100" w:type="dxa"/>
-              <w:end w:w="100" w:type="dxa"/>
+              <w:top w:w="50" w:type="dxa"/>
+              <w:start w:w="0" w:type="dxa"/>
+              <w:bottom w:w="50" w:type="dxa"/>
+              <w:end w:w="144" w:type="dxa"/>
             </w:tcMar>
           </w:tcPr>
           <w:p>
             <w:pPr>
-              <w:spacing w:after="0" w:line="252" w:lineRule="auto"/>
+              <w:spacing w:after="0" w:lineRule="exact" w:line="260"/>
             </w:pPr>
             <w:r>
               <w:rPr>
@@ -1079,20 +1035,22 @@
         </w:tc>
         <w:tc>
           <w:tcPr>
-            <w:tcW w:type="dxa" w:w="6912"/>
+            <w:tcW w:type="dxa" w:w="6120"/>
             <w:tcMar>
-              <w:top w:w="60" w:type="dxa"/>
-              <w:bottom w:w="60" w:type="dxa"/>
-              <w:start w:w="100" w:type="dxa"/>
-              <w:end w:w="100" w:type="dxa"/>
+              <w:top w:w="50" w:type="dxa"/>
+              <w:start w:w="0" w:type="dxa"/>
+              <w:bottom w:w="50" w:type="dxa"/>
+              <w:end w:w="144" w:type="dxa"/>
             </w:tcMar>
           </w:tcPr>
           <w:p>
             <w:pPr>
-              <w:spacing w:after="0" w:line="252" w:lineRule="auto"/>
+              <w:spacing w:after="0" w:lineRule="exact" w:line="260"/>
             </w:pPr>
             <w:r>
               <w:rPr>
+                <w:b w:val="0"/>
+                <w:i w:val="0"/>
                 <w:color w:val="222222"/>
                 <w:sz w:val="20"/>
               </w:rPr>
@@ -1105,10 +1063,12 @@
                 <w:color w:val="222222"/>
                 <w:sz w:val="20"/>
               </w:rPr>
-              <w:t>"the deck is good"</w:t>
+              <w:t>the deck is good</w:t>
             </w:r>
             <w:r>
               <w:rPr>
+                <w:b w:val="0"/>
+                <w:i w:val="0"/>
                 <w:color w:val="222222"/>
                 <w:sz w:val="20"/>
               </w:rPr>
@@ -1120,31 +1080,37 @@
     </w:tbl>
     <w:p>
       <w:pPr>
-        <w:spacing w:after="0" w:line="120" w:lineRule="exact"/>
+        <w:spacing w:after="0" w:lineRule="exact" w:line="120"/>
       </w:pPr>
     </w:p>
     <w:p>
       <w:pPr>
+        <w:pStyle w:val="Heading1"/>
         <w:keepNext/>
-        <w:spacing w:before="200" w:after="60"/>
+        <w:spacing w:before="240" w:after="120" w:lineRule="exact" w:line="360"/>
       </w:pPr>
       <w:r>
         <w:rPr>
+          <w:rFonts w:ascii="Calibri" w:hAnsi="Calibri" w:eastAsia="Calibri"/>
           <w:b/>
           <w:color w:val="0B3C49"/>
-          <w:sz w:val="26"/>
+          <w:sz w:val="28"/>
         </w:rPr>
-        <w:t>6. Getting updates</w:t>
+        <w:t>Getting updates</w:t>
       </w:r>
     </w:p>
     <w:p>
       <w:pPr>
-        <w:spacing w:after="80" w:before="0" w:line="259" w:lineRule="auto"/>
+        <w:keepNext w:val="0"/>
+        <w:widowControl/>
+        <w:spacing w:before="0" w:after="120" w:lineRule="exact" w:line="300"/>
       </w:pPr>
       <w:r>
         <w:rPr>
+          <w:b w:val="0"/>
+          <w:i w:val="0"/>
           <w:color w:val="222222"/>
-          <w:sz w:val="21"/>
+          <w:sz w:val="22"/>
         </w:rPr>
         <w:t xml:space="preserve">Slide Lab checks for updates once a day when you start using it, and asks before installing. Say yes, and restart Claude if it asks you to. To check any time, say </w:t>
       </w:r>
@@ -1153,72 +1119,85 @@
           <w:b/>
           <w:i w:val="0"/>
           <w:color w:val="222222"/>
-          <w:sz w:val="21"/>
+          <w:sz w:val="22"/>
         </w:rPr>
-        <w:t>"update Slide Lab"</w:t>
+        <w:t>update Slide Lab</w:t>
       </w:r>
       <w:r>
         <w:rPr>
+          <w:b w:val="0"/>
+          <w:i w:val="0"/>
           <w:color w:val="222222"/>
-          <w:sz w:val="21"/>
+          <w:sz w:val="22"/>
         </w:rPr>
         <w:t>.</w:t>
       </w:r>
     </w:p>
     <w:p>
       <w:pPr>
+        <w:pStyle w:val="Heading1"/>
         <w:keepNext/>
-        <w:spacing w:before="200" w:after="60"/>
+        <w:spacing w:before="240" w:after="120" w:lineRule="exact" w:line="360"/>
       </w:pPr>
       <w:r>
         <w:rPr>
+          <w:rFonts w:ascii="Calibri" w:hAnsi="Calibri" w:eastAsia="Calibri"/>
           <w:b/>
           <w:color w:val="0B3C49"/>
-          <w:sz w:val="26"/>
+          <w:sz w:val="28"/>
         </w:rPr>
-        <w:t>7. If something goes wrong</w:t>
+        <w:t>If something goes wrong</w:t>
       </w:r>
     </w:p>
     <w:tbl>
       <w:tblPr>
-        <w:tblW w:type="dxa" w:w="9360"/>
+        <w:tblW w:type="dxa" w:w="8207"/>
         <w:jc w:val="left"/>
         <w:tblLayout w:type="fixed"/>
         <w:tblLook w:firstColumn="1" w:firstRow="1" w:lastColumn="0" w:lastRow="0" w:noHBand="0" w:noVBand="1" w:val="04A0"/>
         <w:tblBorders>
-          <w:top w:val="single" w:sz="4" w:color="BFC7CA" w:space="0"/>
-          <w:left w:val="single" w:sz="4" w:color="BFC7CA" w:space="0"/>
-          <w:bottom w:val="single" w:sz="4" w:color="BFC7CA" w:space="0"/>
-          <w:right w:val="single" w:sz="4" w:color="BFC7CA" w:space="0"/>
-          <w:insideH w:val="single" w:sz="4" w:color="BFC7CA" w:space="0"/>
-          <w:insideV w:val="single" w:sz="4" w:color="BFC7CA" w:space="0"/>
+          <w:top w:val="nil" w:space="0"/>
+          <w:left w:val="nil" w:space="0"/>
+          <w:bottom w:val="single" w:sz="4" w:color="C9D1D4" w:space="0"/>
+          <w:right w:val="nil" w:space="0"/>
+          <w:insideH w:val="single" w:sz="4" w:color="C9D1D4" w:space="0"/>
+          <w:insideV w:val="nil" w:space="0"/>
         </w:tblBorders>
         <w:tblLayout w:type="fixed"/>
+        <w:tblInd w:w="0" w:type="dxa"/>
       </w:tblPr>
       <w:tblGrid>
-        <w:gridCol w:w="3168"/>
-        <w:gridCol w:w="6192"/>
+        <w:gridCol w:w="2736"/>
+        <w:gridCol w:w="5472"/>
       </w:tblGrid>
       <w:tr>
+        <w:trPr>
+          <w:tblHeader/>
+          <w:cantSplit/>
+        </w:trPr>
         <w:tc>
           <w:tcPr>
-            <w:tcW w:type="dxa" w:w="3168"/>
-            <w:shd w:val="clear" w:color="auto" w:fill="0B3C49"/>
+            <w:tcW w:type="dxa" w:w="2736"/>
             <w:tcMar>
-              <w:top w:w="60" w:type="dxa"/>
+              <w:top w:w="40" w:type="dxa"/>
+              <w:start w:w="0" w:type="dxa"/>
               <w:bottom w:w="60" w:type="dxa"/>
-              <w:start w:w="100" w:type="dxa"/>
-              <w:end w:w="100" w:type="dxa"/>
+              <w:end w:w="144" w:type="dxa"/>
             </w:tcMar>
+            <w:tcBorders>
+              <w:bottom w:val="single" w:sz="8" w:color="0B3C49" w:space="0"/>
+            </w:tcBorders>
           </w:tcPr>
           <w:p>
             <w:pPr>
-              <w:spacing w:after="0"/>
+              <w:keepNext/>
+              <w:spacing w:after="0" w:lineRule="exact" w:line="260"/>
             </w:pPr>
             <w:r>
               <w:rPr>
                 <w:b/>
-                <w:color w:val="FFFFFF"/>
+                <w:i w:val="0"/>
+                <w:color w:val="0B3C49"/>
                 <w:sz w:val="20"/>
               </w:rPr>
               <w:t>If this happens</w:t>
@@ -1227,23 +1206,27 @@
         </w:tc>
         <w:tc>
           <w:tcPr>
-            <w:tcW w:type="dxa" w:w="6192"/>
-            <w:shd w:val="clear" w:color="auto" w:fill="0B3C49"/>
+            <w:tcW w:type="dxa" w:w="5472"/>
             <w:tcMar>
-              <w:top w:w="60" w:type="dxa"/>
+              <w:top w:w="40" w:type="dxa"/>
+              <w:start w:w="0" w:type="dxa"/>
               <w:bottom w:w="60" w:type="dxa"/>
-              <w:start w:w="100" w:type="dxa"/>
-              <w:end w:w="100" w:type="dxa"/>
+              <w:end w:w="144" w:type="dxa"/>
             </w:tcMar>
+            <w:tcBorders>
+              <w:bottom w:val="single" w:sz="8" w:color="0B3C49" w:space="0"/>
+            </w:tcBorders>
           </w:tcPr>
           <w:p>
             <w:pPr>
-              <w:spacing w:after="0"/>
+              <w:keepNext/>
+              <w:spacing w:after="0" w:lineRule="exact" w:line="260"/>
             </w:pPr>
             <w:r>
               <w:rPr>
                 <w:b/>
-                <w:color w:val="FFFFFF"/>
+                <w:i w:val="0"/>
+                <w:color w:val="0B3C49"/>
                 <w:sz w:val="20"/>
               </w:rPr>
               <w:t>Do this</w:t>
@@ -1257,17 +1240,17 @@
         </w:trPr>
         <w:tc>
           <w:tcPr>
-            <w:tcW w:type="dxa" w:w="3168"/>
+            <w:tcW w:type="dxa" w:w="2736"/>
             <w:tcMar>
-              <w:top w:w="60" w:type="dxa"/>
-              <w:bottom w:w="60" w:type="dxa"/>
-              <w:start w:w="100" w:type="dxa"/>
-              <w:end w:w="100" w:type="dxa"/>
+              <w:top w:w="50" w:type="dxa"/>
+              <w:start w:w="0" w:type="dxa"/>
+              <w:bottom w:w="50" w:type="dxa"/>
+              <w:end w:w="144" w:type="dxa"/>
             </w:tcMar>
           </w:tcPr>
           <w:p>
             <w:pPr>
-              <w:spacing w:after="0" w:line="252" w:lineRule="auto"/>
+              <w:spacing w:after="0" w:lineRule="exact" w:line="260"/>
             </w:pPr>
             <w:r>
               <w:rPr>
@@ -1282,20 +1265,22 @@
         </w:tc>
         <w:tc>
           <w:tcPr>
-            <w:tcW w:type="dxa" w:w="6192"/>
+            <w:tcW w:type="dxa" w:w="5472"/>
             <w:tcMar>
-              <w:top w:w="60" w:type="dxa"/>
-              <w:bottom w:w="60" w:type="dxa"/>
-              <w:start w:w="100" w:type="dxa"/>
-              <w:end w:w="100" w:type="dxa"/>
+              <w:top w:w="50" w:type="dxa"/>
+              <w:start w:w="0" w:type="dxa"/>
+              <w:bottom w:w="50" w:type="dxa"/>
+              <w:end w:w="144" w:type="dxa"/>
             </w:tcMar>
           </w:tcPr>
           <w:p>
             <w:pPr>
-              <w:spacing w:after="0" w:line="252" w:lineRule="auto"/>
+              <w:spacing w:after="0" w:lineRule="exact" w:line="260"/>
             </w:pPr>
             <w:r>
               <w:rPr>
+                <w:b w:val="0"/>
+                <w:i w:val="0"/>
                 <w:color w:val="222222"/>
                 <w:sz w:val="20"/>
               </w:rPr>
@@ -1308,10 +1293,12 @@
                 <w:color w:val="222222"/>
                 <w:sz w:val="20"/>
               </w:rPr>
-              <w:t>"check my Slide Lab setup"</w:t>
+              <w:t>check my Slide Lab setup</w:t>
             </w:r>
             <w:r>
               <w:rPr>
+                <w:b w:val="0"/>
+                <w:i w:val="0"/>
                 <w:color w:val="222222"/>
                 <w:sz w:val="20"/>
               </w:rPr>
@@ -1326,17 +1313,92 @@
         </w:trPr>
         <w:tc>
           <w:tcPr>
-            <w:tcW w:type="dxa" w:w="3168"/>
+            <w:tcW w:type="dxa" w:w="2736"/>
             <w:tcMar>
-              <w:top w:w="60" w:type="dxa"/>
-              <w:bottom w:w="60" w:type="dxa"/>
-              <w:start w:w="100" w:type="dxa"/>
-              <w:end w:w="100" w:type="dxa"/>
+              <w:top w:w="50" w:type="dxa"/>
+              <w:start w:w="0" w:type="dxa"/>
+              <w:bottom w:w="50" w:type="dxa"/>
+              <w:end w:w="144" w:type="dxa"/>
             </w:tcMar>
           </w:tcPr>
           <w:p>
             <w:pPr>
-              <w:spacing w:after="0" w:line="252" w:lineRule="auto"/>
+              <w:spacing w:after="0" w:lineRule="exact" w:line="260"/>
+            </w:pPr>
+            <w:r>
+              <w:rPr>
+                <w:b/>
+                <w:i w:val="0"/>
+                <w:color w:val="222222"/>
+                <w:sz w:val="20"/>
+              </w:rPr>
+              <w:t>The setup check says Git is missing</w:t>
+            </w:r>
+          </w:p>
+        </w:tc>
+        <w:tc>
+          <w:tcPr>
+            <w:tcW w:type="dxa" w:w="5472"/>
+            <w:tcMar>
+              <w:top w:w="50" w:type="dxa"/>
+              <w:start w:w="0" w:type="dxa"/>
+              <w:bottom w:w="50" w:type="dxa"/>
+              <w:end w:w="144" w:type="dxa"/>
+            </w:tcMar>
+          </w:tcPr>
+          <w:p>
+            <w:pPr>
+              <w:spacing w:after="0" w:lineRule="exact" w:line="260"/>
+            </w:pPr>
+            <w:r>
+              <w:rPr>
+                <w:b w:val="0"/>
+                <w:i w:val="0"/>
+                <w:color w:val="222222"/>
+                <w:sz w:val="20"/>
+              </w:rPr>
+              <w:t xml:space="preserve">Git is a download tool Slide Lab uses. It is usually already there, because Claude Code on Windows uses it. Get it from your software portal or </w:t>
+            </w:r>
+            <w:hyperlink r:id="rId13">
+              <w:r>
+                <w:rPr>
+                  <w:rFonts w:ascii="Calibri" w:hAnsi="Calibri"/>
+                  <w:color w:val="0B3C49"/>
+                  <w:u w:val="single"/>
+                  <w:sz w:val="20"/>
+                </w:rPr>
+                <w:t xml:space="preserve">git-scm.com</w:t>
+              </w:r>
+            </w:hyperlink>
+            <w:r>
+              <w:rPr>
+                <w:b w:val="0"/>
+                <w:i w:val="0"/>
+                <w:color w:val="222222"/>
+                <w:sz w:val="20"/>
+              </w:rPr>
+              <w:t>.</w:t>
+            </w:r>
+          </w:p>
+        </w:tc>
+      </w:tr>
+      <w:tr>
+        <w:trPr>
+          <w:cantSplit/>
+        </w:trPr>
+        <w:tc>
+          <w:tcPr>
+            <w:tcW w:type="dxa" w:w="2736"/>
+            <w:tcMar>
+              <w:top w:w="50" w:type="dxa"/>
+              <w:start w:w="0" w:type="dxa"/>
+              <w:bottom w:w="50" w:type="dxa"/>
+              <w:end w:w="144" w:type="dxa"/>
+            </w:tcMar>
+          </w:tcPr>
+          <w:p>
+            <w:pPr>
+              <w:spacing w:after="0" w:lineRule="exact" w:line="260"/>
             </w:pPr>
             <w:r>
               <w:rPr>
@@ -1351,20 +1413,22 @@
         </w:tc>
         <w:tc>
           <w:tcPr>
-            <w:tcW w:type="dxa" w:w="6192"/>
+            <w:tcW w:type="dxa" w:w="5472"/>
             <w:tcMar>
-              <w:top w:w="60" w:type="dxa"/>
-              <w:bottom w:w="60" w:type="dxa"/>
-              <w:start w:w="100" w:type="dxa"/>
-              <w:end w:w="100" w:type="dxa"/>
+              <w:top w:w="50" w:type="dxa"/>
+              <w:start w:w="0" w:type="dxa"/>
+              <w:bottom w:w="50" w:type="dxa"/>
+              <w:end w:w="144" w:type="dxa"/>
             </w:tcMar>
           </w:tcPr>
           <w:p>
             <w:pPr>
-              <w:spacing w:after="0" w:line="252" w:lineRule="auto"/>
+              <w:spacing w:after="0" w:lineRule="exact" w:line="260"/>
             </w:pPr>
             <w:r>
               <w:rPr>
+                <w:b w:val="0"/>
+                <w:i w:val="0"/>
                 <w:color w:val="222222"/>
                 <w:sz w:val="20"/>
               </w:rPr>
@@ -1379,17 +1443,17 @@
         </w:trPr>
         <w:tc>
           <w:tcPr>
-            <w:tcW w:type="dxa" w:w="3168"/>
+            <w:tcW w:type="dxa" w:w="2736"/>
             <w:tcMar>
-              <w:top w:w="60" w:type="dxa"/>
-              <w:bottom w:w="60" w:type="dxa"/>
-              <w:start w:w="100" w:type="dxa"/>
-              <w:end w:w="100" w:type="dxa"/>
+              <w:top w:w="50" w:type="dxa"/>
+              <w:start w:w="0" w:type="dxa"/>
+              <w:bottom w:w="50" w:type="dxa"/>
+              <w:end w:w="144" w:type="dxa"/>
             </w:tcMar>
           </w:tcPr>
           <w:p>
             <w:pPr>
-              <w:spacing w:after="0" w:line="252" w:lineRule="auto"/>
+              <w:spacing w:after="0" w:lineRule="exact" w:line="260"/>
             </w:pPr>
             <w:r>
               <w:rPr>
@@ -1404,20 +1468,22 @@
         </w:tc>
         <w:tc>
           <w:tcPr>
-            <w:tcW w:type="dxa" w:w="6192"/>
+            <w:tcW w:type="dxa" w:w="5472"/>
             <w:tcMar>
-              <w:top w:w="60" w:type="dxa"/>
-              <w:bottom w:w="60" w:type="dxa"/>
-              <w:start w:w="100" w:type="dxa"/>
-              <w:end w:w="100" w:type="dxa"/>
+              <w:top w:w="50" w:type="dxa"/>
+              <w:start w:w="0" w:type="dxa"/>
+              <w:bottom w:w="50" w:type="dxa"/>
+              <w:end w:w="144" w:type="dxa"/>
             </w:tcMar>
           </w:tcPr>
           <w:p>
             <w:pPr>
-              <w:spacing w:after="0" w:line="252" w:lineRule="auto"/>
+              <w:spacing w:after="0" w:lineRule="exact" w:line="260"/>
             </w:pPr>
             <w:r>
               <w:rPr>
+                <w:b w:val="0"/>
+                <w:i w:val="0"/>
                 <w:color w:val="222222"/>
                 <w:sz w:val="20"/>
               </w:rPr>
@@ -1434,6 +1500,8 @@
             </w:r>
             <w:r>
               <w:rPr>
+                <w:b w:val="0"/>
+                <w:i w:val="0"/>
                 <w:color w:val="222222"/>
                 <w:sz w:val="20"/>
               </w:rPr>
@@ -1445,31 +1513,37 @@
     </w:tbl>
     <w:p>
       <w:pPr>
-        <w:spacing w:after="0" w:line="120" w:lineRule="exact"/>
+        <w:spacing w:after="0" w:lineRule="exact" w:line="120"/>
       </w:pPr>
     </w:p>
     <w:p>
       <w:pPr>
+        <w:pStyle w:val="Heading1"/>
         <w:keepNext/>
-        <w:spacing w:before="200" w:after="60"/>
+        <w:spacing w:before="240" w:after="120" w:lineRule="exact" w:line="360"/>
       </w:pPr>
       <w:r>
         <w:rPr>
+          <w:rFonts w:ascii="Calibri" w:hAnsi="Calibri" w:eastAsia="Calibri"/>
           <w:b/>
           <w:color w:val="0B3C49"/>
-          <w:sz w:val="26"/>
+          <w:sz w:val="28"/>
         </w:rPr>
-        <w:t>8. Where to learn more</w:t>
+        <w:t>Where to learn more</w:t>
       </w:r>
     </w:p>
     <w:p>
       <w:pPr>
-        <w:spacing w:after="80" w:before="0" w:line="259" w:lineRule="auto"/>
+        <w:keepNext w:val="0"/>
+        <w:widowControl/>
+        <w:spacing w:before="0" w:after="120" w:lineRule="exact" w:line="300"/>
       </w:pPr>
       <w:r>
         <w:rPr>
+          <w:b w:val="0"/>
+          <w:i w:val="0"/>
           <w:color w:val="222222"/>
-          <w:sz w:val="21"/>
+          <w:sz w:val="22"/>
         </w:rPr>
         <w:t xml:space="preserve">Open </w:t>
       </w:r>
@@ -1478,22 +1552,69 @@
           <w:b/>
           <w:i w:val="0"/>
           <w:color w:val="222222"/>
-          <w:sz w:val="21"/>
+          <w:sz w:val="22"/>
         </w:rPr>
         <w:t>Slide-Lab-Tutorial.html</w:t>
       </w:r>
       <w:r>
         <w:rPr>
+          <w:b w:val="0"/>
+          <w:i w:val="0"/>
           <w:color w:val="222222"/>
-          <w:sz w:val="21"/>
+          <w:sz w:val="22"/>
         </w:rPr>
         <w:t xml:space="preserve"> in the Slide Lab folder for a step-by-step walkthrough with timings. The example files next to it (Slide-Lab-Example-Storyline.html, Slide-Lab-Example-Review.html and Slide-Lab-Example-Deck.pptx) show what each stage looks like.</w:t>
+      </w:r>
+    </w:p>
+    <w:p>
+      <w:pPr>
+        <w:keepNext w:val="0"/>
+        <w:widowControl/>
+        <w:spacing w:before="0" w:after="0" w:lineRule="exact" w:line="260"/>
+      </w:pPr>
+      <w:r>
+        <w:rPr>
+          <w:b/>
+          <w:i w:val="0"/>
+          <w:color w:val="5A5A5A"/>
+          <w:sz w:val="20"/>
+        </w:rPr>
+        <w:t xml:space="preserve">Prefer to type the install commands yourself? </w:t>
+      </w:r>
+      <w:r>
+        <w:rPr>
+          <w:b w:val="0"/>
+          <w:i w:val="0"/>
+          <w:color w:val="5A5A5A"/>
+          <w:sz w:val="20"/>
+        </w:rPr>
+        <w:t xml:space="preserve">See the Install section of README.md in the Slide Lab folder or at </w:t>
+      </w:r>
+      <w:hyperlink r:id="rId14">
+        <w:r>
+          <w:rPr>
+            <w:rFonts w:ascii="Calibri" w:hAnsi="Calibri"/>
+            <w:color w:val="0B3C49"/>
+            <w:u w:val="single"/>
+            <w:sz w:val="20"/>
+          </w:rPr>
+          <w:t xml:space="preserve">https://github.com/mperaltajr/skills</w:t>
+        </w:r>
+      </w:hyperlink>
+      <w:r>
+        <w:rPr>
+          <w:b w:val="0"/>
+          <w:i w:val="0"/>
+          <w:color w:val="5A5A5A"/>
+          <w:sz w:val="20"/>
+        </w:rPr>
+        <w:t>.</w:t>
       </w:r>
     </w:p>
     <w:sectPr>
       <w:footerReference w:type="default" r:id="rId9"/>
       <w:pgSz w:w="12240" w:h="15840"/>
-      <w:pgMar w:top="1152" w:right="1440" w:bottom="1152" w:left="1440" w:header="720" w:footer="720" w:gutter="0"/>
+      <w:pgMar w:top="1008" w:right="2016" w:bottom="1008" w:left="2016" w:header="576" w:footer="504" w:gutter="0"/>
       <w:cols w:space="720"/>
       <w:docGrid w:linePitch="360"/>
     </w:sectPr>
@@ -1506,7 +1627,6 @@
   <w:p>
     <w:pPr>
       <w:pStyle w:val="Footer"/>
-      <w:jc w:val="left"/>
     </w:pPr>
     <w:r>
       <w:rPr>
@@ -1528,6 +1648,48 @@
         <w:sz w:val="17"/>
       </w:rPr>
       <w:instrText xml:space="preserve"> PAGE </w:instrText>
+    </w:r>
+    <w:r>
+      <w:rPr>
+        <w:color w:val="5A5A5A"/>
+        <w:sz w:val="17"/>
+      </w:rPr>
+      <w:fldChar w:fldCharType="separate"/>
+    </w:r>
+    <w:r>
+      <w:rPr>
+        <w:color w:val="5A5A5A"/>
+        <w:sz w:val="17"/>
+      </w:rPr>
+      <w:t>1</w:t>
+    </w:r>
+    <w:r>
+      <w:rPr>
+        <w:color w:val="5A5A5A"/>
+        <w:sz w:val="17"/>
+      </w:rPr>
+      <w:fldChar w:fldCharType="end"/>
+    </w:r>
+    <w:r>
+      <w:rPr>
+        <w:color w:val="5A5A5A"/>
+        <w:sz w:val="17"/>
+      </w:rPr>
+      <w:t xml:space="preserve"> of </w:t>
+    </w:r>
+    <w:r>
+      <w:rPr>
+        <w:color w:val="5A5A5A"/>
+        <w:sz w:val="17"/>
+      </w:rPr>
+      <w:fldChar w:fldCharType="begin"/>
+    </w:r>
+    <w:r>
+      <w:rPr>
+        <w:color w:val="5A5A5A"/>
+        <w:sz w:val="17"/>
+      </w:rPr>
+      <w:instrText xml:space="preserve"> NUMPAGES </w:instrText>
     </w:r>
     <w:r>
       <w:rPr>
@@ -1920,7 +2082,7 @@
     <w:rPr>
       <w:rFonts w:ascii="Calibri" w:hAnsi="Calibri" w:eastAsia="Calibri"/>
       <w:color w:val="222222"/>
-      <w:sz w:val="21"/>
+      <w:sz w:val="22"/>
     </w:rPr>
   </w:style>
   <w:style w:type="paragraph" w:styleId="Header">
@@ -1959,10 +2121,6 @@
       </w:tabs>
       <w:spacing w:after="0" w:line="240" w:lineRule="auto"/>
     </w:pPr>
-    <w:rPr>
-      <w:color w:val="5A5A5A"/>
-      <w:sz w:val="17"/>
-    </w:rPr>
   </w:style>
   <w:style w:type="character" w:customStyle="1" w:styleId="FooterChar">
     <w:name w:val="Footer Char"/>
@@ -1986,10 +2144,10 @@
       <w:outlineLvl w:val="0"/>
     </w:pPr>
     <w:rPr>
-      <w:rFonts w:asciiTheme="majorHAnsi" w:eastAsiaTheme="majorEastAsia" w:hAnsiTheme="majorHAnsi" w:cstheme="majorBidi"/>
+      <w:rFonts w:ascii="Calibri" w:hAnsi="Calibri" w:eastAsia="Calibri"/>
       <w:b/>
       <w:bCs/>
-      <w:color w:val="365F91" w:themeColor="accent1" w:themeShade="BF"/>
+      <w:color w:val="0B3C49"/>
       <w:sz w:val="28"/>
       <w:szCs w:val="28"/>
     </w:rPr>
@@ -2455,10 +2613,6 @@
       </w:numPr>
       <w:contextualSpacing/>
     </w:pPr>
-    <w:rPr>
-      <w:rFonts w:ascii="Calibri" w:hAnsi="Calibri"/>
-      <w:sz w:val="21"/>
-    </w:rPr>
   </w:style>
   <w:style w:type="paragraph" w:styleId="ListBullet2">
     <w:name w:val="List Bullet 2"/>
@@ -2498,10 +2652,6 @@
       </w:numPr>
       <w:contextualSpacing/>
     </w:pPr>
-    <w:rPr>
-      <w:rFonts w:ascii="Calibri" w:hAnsi="Calibri"/>
-      <w:sz w:val="21"/>
-    </w:rPr>
   </w:style>
   <w:style w:type="paragraph" w:styleId="ListNumber2">
     <w:name w:val="List Number 2"/>

</xml_diff>

<commit_message>
feat(install): narrower permissions, PowerPoint fallback, one install path
From the committee audit (approved 2026-10-05):
- doctor.py grants only Slide Lab's own scripts (py -3 ...), reading, writing
  under ~/Slide Lab and the skills folder, and the two agents; it used to add
  unscoped Bash/PowerShell/Write/Edit/WebFetch for every project.
- No LibreOffice on Windows: previews, the final check and QC draw with
  PowerPoint instead (read-only, hidden, closes only its own deck, quits
  PowerPoint only if it started it); registration and the setup check accept
  it. Tested with PowerPoint open.
- One install path: slide-builder/requirements.txt pinned versions with no
  Python 3.14 builds; it now points at the top-level list. "First time here"
  points at the README and doctor.py. matplotlib dropped (never imported).
- The paste-in request updates an existing Slide Lab folder instead of
  failing; manual clones use --depth 1.

Co-Authored-By: Claude Opus 5.5 <noreply@anthropic.com>
</commit_message>
<xml_diff>
--- a/Slide-Lab-Install-Guide.docx
+++ b/Slide-Lab-Install-Guide.docx
@@ -609,7 +609,7 @@
           <w:color w:val="222222"/>
           <w:sz w:val="20"/>
         </w:rPr>
-        <w:t>Install Slide Lab for me. Clone https://github.com/mperaltajr/skills into my .claude\skills folder (~/.claude/skills on a Mac), then follow the "Doing it by hand" steps in its README.md for my computer. Run each command on its own so I can approve it, and finish by running doctor.py and showing me its table.</w:t>
+        <w:t>Install Slide Lab for me: clone https://github.com/mperaltajr/skills into my .claude\skills folder (~/.claude/skills on a Mac), or git pull if it is already there. Then follow the "Doing it by hand" steps in its README.md, one command at a time so I can approve each, and finish by running doctor.py and showing me its table.</w:t>
       </w:r>
     </w:p>
     <w:p>
@@ -1633,7 +1633,7 @@
         <w:color w:val="5A5A5A"/>
         <w:sz w:val="17"/>
       </w:rPr>
-      <w:t xml:space="preserve">Slide Lab install guide  |  Accurate as of 2 October 2026  |  Page </w:t>
+      <w:t xml:space="preserve">Slide Lab install guide  |  Accurate as of 5 October 2026  |  Page </w:t>
     </w:r>
     <w:r>
       <w:rPr>

</xml_diff>

<commit_message>
Render through PowerPoint by default on Windows, one deck per round, PowerPoint opens-cleanly check before done
- render_slides.render/to_pdf: default renderer (settings.json renderer: auto|powerpoint|libreoffice; auto = PowerPoint on Windows), the other takes over after two failures, hidden slides kept in place, one-line PowerPoint notice per command
- one_deck.py: self-check and finalize render all slides of a round as one deck, split pages back, isolate a failing slide by halving
- compile_picks: PowerPoint opens-cleanly check (read-only, no repair, slide count) before replacing the deck
- registration, style refs, compile and slide-qc renders use the default renderer; doctor: LibreOffice optional on Windows with PowerPoint
- docs: SKILL notices, slide-qc, README install, install guide (2 pages), CHANGELOG
- smokes: one-deck mapping, renderer default/fallback/notice, opens-cleanly, PowerPoint-only end to end

Co-Authored-By: Claude Opus 5.5 <noreply@anthropic.com>
</commit_message>
<xml_diff>
--- a/Slide-Lab-Install-Guide.docx
+++ b/Slide-Lab-Install-Guide.docx
@@ -28,7 +28,7 @@
           <w:color w:val="5A5A5A"/>
           <w:sz w:val="24"/>
         </w:rPr>
-        <w:t>Three steps, about 20 to 45 minutes the first time, plus however long your software portal takes to approve and install LibreOffice.</w:t>
+        <w:t>Three steps, about 20 to 45 minutes the first time.</w:t>
       </w:r>
     </w:p>
     <w:p>
@@ -63,7 +63,7 @@
           <w:color w:val="0B3C49"/>
           <w:sz w:val="28"/>
         </w:rPr>
-        <w:t>Step 1. Install three programs yourself</w:t>
+        <w:t>Step 1. Install these programs yourself</w:t>
       </w:r>
     </w:p>
     <w:tbl>
@@ -112,7 +112,7 @@
                 <w:color w:val="222222"/>
                 <w:sz w:val="22"/>
               </w:rPr>
-              <w:t xml:space="preserve">Request LibreOffice on day one. </w:t>
+              <w:t xml:space="preserve">On a Mac, request LibreOffice on day one. </w:t>
             </w:r>
             <w:r>
               <w:rPr>
@@ -121,7 +121,7 @@
                 <w:color w:val="222222"/>
                 <w:sz w:val="22"/>
               </w:rPr>
-              <w:t>On company computers it can need approval.</w:t>
+              <w:t>It can need approval.</w:t>
             </w:r>
           </w:p>
         </w:tc>
@@ -470,7 +470,7 @@
                 <w:color w:val="222222"/>
                 <w:sz w:val="20"/>
               </w:rPr>
-              <w:t>LibreOffice</w:t>
+              <w:t>LibreOffice (Mac only)</w:t>
             </w:r>
           </w:p>
         </w:tc>
@@ -495,7 +495,7 @@
                 <w:color w:val="222222"/>
                 <w:sz w:val="20"/>
               </w:rPr>
-              <w:t>Draws slide previews. Required on a Mac; on Windows, PowerPoint can stand in (slower)</w:t>
+              <w:t>Draws slide previews on a Mac (Windows uses PowerPoint)</w:t>
             </w:r>
           </w:p>
         </w:tc>
@@ -682,7 +682,7 @@
       <w:pPr>
         <w:keepNext w:val="0"/>
         <w:widowControl/>
-        <w:spacing w:before="0" w:after="0" w:lineRule="exact" w:line="300"/>
+        <w:spacing w:before="0" w:after="120" w:lineRule="exact" w:line="300"/>
       </w:pPr>
       <w:r>
         <w:rPr>
@@ -710,6 +710,22 @@
           <w:sz w:val="22"/>
         </w:rPr>
         <w:t xml:space="preserve"> or just ask for a deck.</w:t>
+      </w:r>
+    </w:p>
+    <w:p>
+      <w:pPr>
+        <w:keepNext w:val="0"/>
+        <w:widowControl/>
+        <w:spacing w:before="0" w:after="0" w:lineRule="exact" w:line="300"/>
+      </w:pPr>
+      <w:r>
+        <w:rPr>
+          <w:b w:val="0"/>
+          <w:i w:val="0"/>
+          <w:color w:val="222222"/>
+          <w:sz w:val="22"/>
+        </w:rPr>
+        <w:t>On Windows, PowerPoint may pause briefly while Slide Lab draws previews.</w:t>
       </w:r>
     </w:p>
     <w:p>
@@ -1633,7 +1649,7 @@
         <w:color w:val="5A5A5A"/>
         <w:sz w:val="17"/>
       </w:rPr>
-      <w:t xml:space="preserve">Slide Lab install guide  |  Accurate as of 5 October 2026  |  Page </w:t>
+      <w:t xml:space="preserve">Slide Lab install guide  |  Accurate as of 9 October 2026  |  Page </w:t>
     </w:r>
     <w:r>
       <w:rPr>

</xml_diff>